<commit_message>
Remove the stray «F» from the Indicaciones template
It sat in the 1 pt paragraph Word needs after the final table, so it
printed as a speck at the bottom of every Indicaciones sheet. The
paragraph stays (it keeps the table from spilling onto a blank page);
only the character goes. Golden text updated to match.

Co-Authored-By: Claude Opus 5.5 <noreply@anthropic.com>
Claude-Session: https://claude.ai/code/session_019BQfcSc89WGTNuxaTxAkGH
</commit_message>
<xml_diff>
--- a/packages/core/template_indicaciones.docx
+++ b/packages/core/template_indicaciones.docx
@@ -8334,13 +8334,6 @@
           <w:u w:val="words"/>
         </w:rPr>
       </w:pPr>
-      <w:r>
-        <w:rPr>
-          <w:sz w:val="2"/>
-          <w:szCs w:val="2"/>
-        </w:rPr>
-        <w:t>F</w:t>
-      </w:r>
     </w:p>
     <w:sectPr>
       <w:headerReference w:type="default" r:id="rId8"/>

</xml_diff>